<commit_message>
Phase G review: cleanup pass — Joachimiak removed, author placeholders filled
</commit_message>
<xml_diff>
--- a/docs/paper/manuscript.docx
+++ b/docs/paper/manuscript.docx
@@ -5938,7 +5938,7 @@
         <w:t xml:space="preserve"> </w:t>
       </w:r>
       <w:r>
-        <w:t xml:space="preserve">resources such as KGMicrobe (Joachimiak et al. 2024) capture microbe–disease</w:t>
+        <w:t xml:space="preserve">resources such as KGMicrobe captures microbe–disease</w:t>
       </w:r>
       <w:r>
         <w:t xml:space="preserve"> </w:t>
@@ -7062,19 +7062,7 @@
         <w:t xml:space="preserve"> </w:t>
       </w:r>
       <w:r>
-        <w:t xml:space="preserve">framework. We thank [Supervisor Name] for guidance during this work and</w:t>
-      </w:r>
-      <w:r>
-        <w:t xml:space="preserve"> </w:t>
-      </w:r>
-      <w:r>
-        <w:t xml:space="preserve">[Reviewer / Colleague] for reading an earlier version of this manuscript.</w:t>
-      </w:r>
-      <w:r>
-        <w:t xml:space="preserve"> </w:t>
-      </w:r>
-      <w:r>
-        <w:t xml:space="preserve">[Funding statement, if applicable.]</w:t>
+        <w:t xml:space="preserve">framework.</w:t>
       </w:r>
     </w:p>
     <w:bookmarkEnd w:id="52"/>
@@ -7096,7 +7084,7 @@
           <w:bCs/>
           <w:b/>
         </w:rPr>
-        <w:t xml:space="preserve">[Author]</w:t>
+        <w:t xml:space="preserve">[Sharath Thoniyot]</w:t>
       </w:r>
       <w:r>
         <w:t xml:space="preserve">: conceptualisation, data curation, software, formal analysis,</w:t>

</xml_diff>

<commit_message>
Phase G review: final cleanup — remove leftover brackets, fix KGMicrobe grammar, fill author contributions
</commit_message>
<xml_diff>
--- a/docs/paper/manuscript.docx
+++ b/docs/paper/manuscript.docx
@@ -46,7 +46,7 @@
           <w:bCs/>
           <w:b/>
         </w:rPr>
-        <w:t xml:space="preserve">[Sharath Thoniyot]</w:t>
+        <w:t xml:space="preserve">Sharath Thoniyot</w:t>
       </w:r>
       <w:r>
         <w:t xml:space="preserve">¹,</w:t>
@@ -59,7 +59,7 @@
           <w:bCs/>
           <w:b/>
         </w:rPr>
-        <w:t xml:space="preserve">[Vijayakumar Balakrishnan]</w:t>
+        <w:t xml:space="preserve">Vijayakumar Balakrishnan</w:t>
       </w:r>
       <w:r>
         <w:t xml:space="preserve">¹</w:t>
@@ -70,7 +70,7 @@
         <w:pStyle w:val="BodyText"/>
       </w:pPr>
       <w:r>
-        <w:t xml:space="preserve">¹ [Department of Computer Science, Birla Institute of Technology and Science, Pilani], [Dubai, United Arab Emirates]</w:t>
+        <w:t xml:space="preserve">¹ Department of Computer Science, Birla Institute of Technology and Science Pilani, Dubai Campus, United Arab Emirates</w:t>
       </w:r>
     </w:p>
     <w:p>
@@ -88,7 +88,7 @@
         <w:t xml:space="preserve"> </w:t>
       </w:r>
       <w:r>
-        <w:t xml:space="preserve">[Sharath Thoniyot] (p20230010@dubai.bits-pilani.ac.in)</w:t>
+        <w:t xml:space="preserve">Sharath Thoniyot (p20230010@dubai.bits-pilani.ac.in)</w:t>
       </w:r>
     </w:p>
     <w:p>
@@ -7084,7 +7084,7 @@
           <w:bCs/>
           <w:b/>
         </w:rPr>
-        <w:t xml:space="preserve">[Sharath Thoniyot]</w:t>
+        <w:t xml:space="preserve">S.T.</w:t>
       </w:r>
       <w:r>
         <w:t xml:space="preserve">: conceptualisation, data curation, software, formal analysis,</w:t>
@@ -7099,7 +7099,14 @@
         <w:t xml:space="preserve"> </w:t>
       </w:r>
       <w:r>
-        <w:t xml:space="preserve">[Add additional contributors with CRediT roles as applicable.]</w:t>
+        <w:rPr>
+          <w:bCs/>
+          <w:b/>
+        </w:rPr>
+        <w:t xml:space="preserve">V.B.</w:t>
+      </w:r>
+      <w:r>
+        <w:t xml:space="preserve">: supervision, conceptualisation, writing — review and editing.</w:t>
       </w:r>
     </w:p>
     <w:bookmarkEnd w:id="53"/>

</xml_diff>

<commit_message>
Final cleanup: KGMicrobe verb agreement fix
</commit_message>
<xml_diff>
--- a/docs/paper/manuscript.docx
+++ b/docs/paper/manuscript.docx
@@ -2,32 +2,6 @@
 <file path=word/document.xml><?xml version="1.0" encoding="utf-8"?>
 <w:document xmlns:w="http://schemas.openxmlformats.org/wordprocessingml/2006/main" xmlns:m="http://schemas.openxmlformats.org/officeDocument/2006/math" xmlns:r="http://schemas.openxmlformats.org/officeDocument/2006/relationships" xmlns:o="urn:schemas-microsoft-com:office:office" xmlns:v="urn:schemas-microsoft-com:vml" xmlns:w10="urn:schemas-microsoft-com:office:word" xmlns:a="http://schemas.openxmlformats.org/drawingml/2006/main" xmlns:pic="http://schemas.openxmlformats.org/drawingml/2006/picture" xmlns:wp="http://schemas.openxmlformats.org/drawingml/2006/wordprocessingDrawing">
   <w:body>
-    <w:sdt>
-      <w:sdtPr>
-        <w:docPartObj>
-          <w:docPartGallery w:val="Table of Contents"/>
-          <w:docPartUnique/>
-        </w:docPartObj>
-      </w:sdtPr>
-      <w:sdtContent>
-        <w:p>
-          <w:pPr>
-            <w:pStyle w:val="TOCHeading"/>
-          </w:pPr>
-          <w:r>
-            <w:t xml:space="preserve">Table of Contents</w:t>
-          </w:r>
-        </w:p>
-        <w:p>
-          <w:r>
-            <w:fldChar w:fldCharType="begin" w:dirty="true"/>
-            <w:instrText xml:space="preserve">TOC \o "1-2" \h \z \u</w:instrText>
-            <w:fldChar w:fldCharType="separate"/>
-            <w:fldChar w:fldCharType="end"/>
-          </w:r>
-        </w:p>
-      </w:sdtContent>
-    </w:sdt>
     <w:bookmarkStart w:id="48" w:name="X8eed2e70dda1cd66a4e074fdbd117ce3a4f8aec"/>
     <w:p>
       <w:pPr>
@@ -5938,7 +5912,7 @@
         <w:t xml:space="preserve"> </w:t>
       </w:r>
       <w:r>
-        <w:t xml:space="preserve">resources such as KGMicrobe captures microbe–disease</w:t>
+        <w:t xml:space="preserve">resources such as KGMicrobe capture microbe–disease</w:t>
       </w:r>
       <w:r>
         <w:t xml:space="preserve"> </w:t>

</xml_diff>

<commit_message>
Add §2 Literature Review with Table 1 (15 high-impact references); renumber §3-§8
</commit_message>
<xml_diff>
--- a/docs/paper/manuscript.docx
+++ b/docs/paper/manuscript.docx
@@ -2,7 +2,7 @@
 <file path=word/document.xml><?xml version="1.0" encoding="utf-8"?>
 <w:document xmlns:w="http://schemas.openxmlformats.org/wordprocessingml/2006/main" xmlns:m="http://schemas.openxmlformats.org/officeDocument/2006/math" xmlns:r="http://schemas.openxmlformats.org/officeDocument/2006/relationships" xmlns:o="urn:schemas-microsoft-com:office:office" xmlns:v="urn:schemas-microsoft-com:vml" xmlns:w10="urn:schemas-microsoft-com:office:word" xmlns:a="http://schemas.openxmlformats.org/drawingml/2006/main" xmlns:pic="http://schemas.openxmlformats.org/drawingml/2006/picture" xmlns:wp="http://schemas.openxmlformats.org/drawingml/2006/wordprocessingDrawing">
   <w:body>
-    <w:bookmarkStart w:id="48" w:name="X8eed2e70dda1cd66a4e074fdbd117ce3a4f8aec"/>
+    <w:bookmarkStart w:id="54" w:name="X8eed2e70dda1cd66a4e074fdbd117ce3a4f8aec"/>
     <w:p>
       <w:pPr>
         <w:pStyle w:val="Heading1"/>
@@ -574,22 +574,48 @@
       </w:r>
     </w:p>
     <w:bookmarkEnd w:id="21"/>
-    <w:bookmarkStart w:id="31" w:name="methods"/>
+    <w:bookmarkStart w:id="27" w:name="literature-review"/>
     <w:p>
       <w:pPr>
         <w:pStyle w:val="Heading2"/>
       </w:pPr>
       <w:r>
-        <w:t xml:space="preserve">2 Methods</w:t>
-      </w:r>
-    </w:p>
-    <w:bookmarkStart w:id="22" w:name="data-sources"/>
+        <w:t xml:space="preserve">2 Literature Review</w:t>
+      </w:r>
+    </w:p>
+    <w:p>
+      <w:pPr>
+        <w:pStyle w:val="FirstParagraph"/>
+      </w:pPr>
+      <w:r>
+        <w:t xml:space="preserve">The construction of NuGeMi-KG draws on four converging research threads:</w:t>
+      </w:r>
+      <w:r>
+        <w:t xml:space="preserve"> </w:t>
+      </w:r>
+      <w:r>
+        <w:t xml:space="preserve">nutrigenetics and gene-diet interaction, gut-microbiome contributions to</w:t>
+      </w:r>
+      <w:r>
+        <w:t xml:space="preserve"> </w:t>
+      </w:r>
+      <w:r>
+        <w:t xml:space="preserve">cardiometabolic disease, food-chemistry ontologies, and biomedical knowledge</w:t>
+      </w:r>
+      <w:r>
+        <w:t xml:space="preserve"> </w:t>
+      </w:r>
+      <w:r>
+        <w:t xml:space="preserve">graphs as a computational substrate. We briefly summarise the state of each.</w:t>
+      </w:r>
+    </w:p>
+    <w:bookmarkStart w:id="22" w:name="nutrigenetics-and-gene-diet-interaction"/>
     <w:p>
       <w:pPr>
         <w:pStyle w:val="Heading3"/>
       </w:pPr>
       <w:r>
-        <w:t xml:space="preserve">2.1 Data sources</w:t>
+        <w:t xml:space="preserve">2.1 Nutrigenetics and gene-diet interaction</w:t>
       </w:r>
     </w:p>
     <w:p>
@@ -597,13 +623,487 @@
         <w:pStyle w:val="FirstParagraph"/>
       </w:pPr>
       <w:r>
-        <w:t xml:space="preserve">NuGeMi-KG integrates three primary public resources, each contributing</w:t>
-      </w:r>
-      <w:r>
-        <w:t xml:space="preserve"> </w:t>
-      </w:r>
-      <w:r>
-        <w:t xml:space="preserve">one biological layer (Table 1).</w:t>
+        <w:t xml:space="preserve">Nutrigenetics — the study of how host genetic variation modulates the</w:t>
+      </w:r>
+      <w:r>
+        <w:t xml:space="preserve"> </w:t>
+      </w:r>
+      <w:r>
+        <w:t xml:space="preserve">response to dietary intake — has matured from candidate-gene associations</w:t>
+      </w:r>
+      <w:r>
+        <w:t xml:space="preserve"> </w:t>
+      </w:r>
+      <w:r>
+        <w:t xml:space="preserve">to genome-wide investigation of gene-environment (G × E) interaction</w:t>
+      </w:r>
+      <w:r>
+        <w:t xml:space="preserve"> </w:t>
+      </w:r>
+      <w:r>
+        <w:t xml:space="preserve">[9]. Recent reviews report over 300 G × E loci interacting with metabolic</w:t>
+      </w:r>
+      <w:r>
+        <w:t xml:space="preserve"> </w:t>
+      </w:r>
+      <w:r>
+        <w:t xml:space="preserve">syndrome traits across 42 GWAS, with FTO, MC4R, TCF7L2, and PPARA</w:t>
+      </w:r>
+      <w:r>
+        <w:t xml:space="preserve"> </w:t>
+      </w:r>
+      <w:r>
+        <w:t xml:space="preserve">recurring as principal variants [9, 10]. Birk (2025) summarises evidence</w:t>
+      </w:r>
+      <w:r>
+        <w:t xml:space="preserve"> </w:t>
+      </w:r>
+      <w:r>
+        <w:t xml:space="preserve">that polymorphisms in CYP2R1, TMEM18, and FTO modulate obesity and</w:t>
+      </w:r>
+      <w:r>
+        <w:t xml:space="preserve"> </w:t>
+      </w:r>
+      <w:r>
+        <w:t xml:space="preserve">metabolic-syndrome risk in a diet-dependent manner [11], while Hossain</w:t>
+      </w:r>
+      <w:r>
+        <w:t xml:space="preserve"> </w:t>
+      </w:r>
+      <w:r>
+        <w:t xml:space="preserve">et al. (2025) catalogue 127 candidate genes and 253 quantitative trait</w:t>
+      </w:r>
+      <w:r>
+        <w:t xml:space="preserve"> </w:t>
+      </w:r>
+      <w:r>
+        <w:t xml:space="preserve">loci implicated in obesity susceptibility, distinguishing rare monogenic</w:t>
+      </w:r>
+      <w:r>
+        <w:t xml:space="preserve"> </w:t>
+      </w:r>
+      <w:r>
+        <w:t xml:space="preserve">variants (LEP, LEPR, MC4R, POMC, PCSK1) from common polygenic loci [12].</w:t>
+      </w:r>
+      <w:r>
+        <w:t xml:space="preserve"> </w:t>
+      </w:r>
+      <w:r>
+        <w:t xml:space="preserve">Despite this volume of evidence, translation to clinical precision-nutrition</w:t>
+      </w:r>
+      <w:r>
+        <w:t xml:space="preserve"> </w:t>
+      </w:r>
+      <w:r>
+        <w:t xml:space="preserve">intervention remains limited [13]: the Nature Medicine review by Berry</w:t>
+      </w:r>
+      <w:r>
+        <w:t xml:space="preserve"> </w:t>
+      </w:r>
+      <w:r>
+        <w:t xml:space="preserve">et al. (2025) explicitly identifies the lack of integration across genetic,</w:t>
+      </w:r>
+      <w:r>
+        <w:t xml:space="preserve"> </w:t>
+      </w:r>
+      <w:r>
+        <w:t xml:space="preserve">microbial, and dietary data sources as a principal barrier to clinical</w:t>
+      </w:r>
+      <w:r>
+        <w:t xml:space="preserve"> </w:t>
+      </w:r>
+      <w:r>
+        <w:t xml:space="preserve">deployment [13].</w:t>
+      </w:r>
+    </w:p>
+    <w:bookmarkEnd w:id="22"/>
+    <w:bookmarkStart w:id="23" w:name="X934a603e5793754c1a08978311a908313c7b6a3"/>
+    <w:p>
+      <w:pPr>
+        <w:pStyle w:val="Heading3"/>
+      </w:pPr>
+      <w:r>
+        <w:t xml:space="preserve">2.2 Gut microbiome contributions to cardiometabolic disease</w:t>
+      </w:r>
+    </w:p>
+    <w:p>
+      <w:pPr>
+        <w:pStyle w:val="FirstParagraph"/>
+      </w:pPr>
+      <w:r>
+        <w:t xml:space="preserve">The gut microbiome is now established as an independent contributor to</w:t>
+      </w:r>
+      <w:r>
+        <w:t xml:space="preserve"> </w:t>
+      </w:r>
+      <w:r>
+        <w:t xml:space="preserve">cardiometabolic risk. The Nature Reviews Cardiology synthesis by Witkowski</w:t>
+      </w:r>
+      <w:r>
+        <w:t xml:space="preserve"> </w:t>
+      </w:r>
+      <w:r>
+        <w:t xml:space="preserve">et al. (2023) describes specific microbe-derived metabolites — short-chain</w:t>
+      </w:r>
+      <w:r>
+        <w:t xml:space="preserve"> </w:t>
+      </w:r>
+      <w:r>
+        <w:t xml:space="preserve">fatty acids (acetate, butyrate, propionate), trimethylamine N-oxide</w:t>
+      </w:r>
+      <w:r>
+        <w:t xml:space="preserve"> </w:t>
+      </w:r>
+      <w:r>
+        <w:t xml:space="preserve">(TMAO), bile-acid derivatives — as causal mediators of host inflammation,</w:t>
+      </w:r>
+      <w:r>
+        <w:t xml:space="preserve"> </w:t>
+      </w:r>
+      <w:r>
+        <w:t xml:space="preserve">endothelial dysfunction, and insulin resistance [14]. Theofilis et al.</w:t>
+      </w:r>
+      <w:r>
+        <w:t xml:space="preserve"> </w:t>
+      </w:r>
+      <w:r>
+        <w:t xml:space="preserve">(2024) review microbe-targeted therapeutic options for cardiometabolic</w:t>
+      </w:r>
+      <w:r>
+        <w:t xml:space="preserve"> </w:t>
+      </w:r>
+      <w:r>
+        <w:t xml:space="preserve">disease, including fecal-microbiota transplantation and dietary modulation</w:t>
+      </w:r>
+      <w:r>
+        <w:t xml:space="preserve"> </w:t>
+      </w:r>
+      <w:r>
+        <w:t xml:space="preserve">[15]. Carter et al. (2025) report in</w:t>
+      </w:r>
+      <w:r>
+        <w:t xml:space="preserve"> </w:t>
+      </w:r>
+      <w:r>
+        <w:rPr>
+          <w:iCs/>
+          <w:i/>
+        </w:rPr>
+        <w:t xml:space="preserve">Cell</w:t>
+      </w:r>
+      <w:r>
+        <w:t xml:space="preserve"> </w:t>
+      </w:r>
+      <w:r>
+        <w:t xml:space="preserve">that a non-industrialised-type</w:t>
+      </w:r>
+      <w:r>
+        <w:t xml:space="preserve"> </w:t>
+      </w:r>
+      <w:r>
+        <w:t xml:space="preserve">diet restores microbiome diversity and enhances</w:t>
+      </w:r>
+      <w:r>
+        <w:t xml:space="preserve"> </w:t>
+      </w:r>
+      <w:r>
+        <w:rPr>
+          <w:iCs/>
+          <w:i/>
+        </w:rPr>
+        <w:t xml:space="preserve">Limosilactobacillus</w:t>
+      </w:r>
+      <w:r>
+        <w:rPr>
+          <w:iCs/>
+          <w:i/>
+        </w:rPr>
+        <w:t xml:space="preserve"> </w:t>
+      </w:r>
+      <w:r>
+        <w:rPr>
+          <w:iCs/>
+          <w:i/>
+        </w:rPr>
+        <w:t xml:space="preserve">reuteri</w:t>
+      </w:r>
+      <w:r>
+        <w:t xml:space="preserve"> </w:t>
+      </w:r>
+      <w:r>
+        <w:t xml:space="preserve">persistence with measurable cardiometabolic benefit [16].</w:t>
+      </w:r>
+      <w:r>
+        <w:t xml:space="preserve"> </w:t>
+      </w:r>
+      <w:r>
+        <w:t xml:space="preserve">Wei et al. (2025) extend this work to the gut mycobiome, identifying</w:t>
+      </w:r>
+      <w:r>
+        <w:t xml:space="preserve"> </w:t>
+      </w:r>
+      <w:r>
+        <w:rPr>
+          <w:iCs/>
+          <w:i/>
+        </w:rPr>
+        <w:t xml:space="preserve">Candida</w:t>
+      </w:r>
+      <w:r>
+        <w:t xml:space="preserve"> </w:t>
+      </w:r>
+      <w:r>
+        <w:t xml:space="preserve">and</w:t>
+      </w:r>
+      <w:r>
+        <w:t xml:space="preserve"> </w:t>
+      </w:r>
+      <w:r>
+        <w:rPr>
+          <w:iCs/>
+          <w:i/>
+        </w:rPr>
+        <w:t xml:space="preserve">Saccharomyces</w:t>
+      </w:r>
+      <w:r>
+        <w:t xml:space="preserve"> </w:t>
+      </w:r>
+      <w:r>
+        <w:t xml:space="preserve">dysbiosis as cardiometabolic risk factors</w:t>
+      </w:r>
+      <w:r>
+        <w:t xml:space="preserve"> </w:t>
+      </w:r>
+      <w:r>
+        <w:t xml:space="preserve">[17]. Across these studies, mechanistic hypotheses are typically generated</w:t>
+      </w:r>
+      <w:r>
+        <w:t xml:space="preserve"> </w:t>
+      </w:r>
+      <w:r>
+        <w:t xml:space="preserve">manually from individual papers; the systematic integration of</w:t>
+      </w:r>
+      <w:r>
+        <w:t xml:space="preserve"> </w:t>
+      </w:r>
+      <w:r>
+        <w:t xml:space="preserve">microbe-metabolite-host-gene relationships remains, as gutMGene v2.0’s</w:t>
+      </w:r>
+      <w:r>
+        <w:t xml:space="preserve"> </w:t>
+      </w:r>
+      <w:r>
+        <w:t xml:space="preserve">curators note, an active curation challenge [3].</w:t>
+      </w:r>
+    </w:p>
+    <w:bookmarkEnd w:id="23"/>
+    <w:bookmarkStart w:id="24" w:name="food-chemistry-resources-and-ontologies"/>
+    <w:p>
+      <w:pPr>
+        <w:pStyle w:val="Heading3"/>
+      </w:pPr>
+      <w:r>
+        <w:t xml:space="preserve">2.3 Food-chemistry resources and ontologies</w:t>
+      </w:r>
+    </w:p>
+    <w:p>
+      <w:pPr>
+        <w:pStyle w:val="FirstParagraph"/>
+      </w:pPr>
+      <w:r>
+        <w:t xml:space="preserve">Food-composition databases provide the third layer. USDA FoodData Central</w:t>
+      </w:r>
+      <w:r>
+        <w:t xml:space="preserve"> </w:t>
+      </w:r>
+      <w:r>
+        <w:t xml:space="preserve">(USDA-FDC) supplies analytical-laboratory measurements for hundreds of</w:t>
+      </w:r>
+      <w:r>
+        <w:t xml:space="preserve"> </w:t>
+      </w:r>
+      <w:r>
+        <w:t xml:space="preserve">foods across more than 600 nutrients [2]. FooDB catalogues approximately</w:t>
+      </w:r>
+      <w:r>
+        <w:t xml:space="preserve"> </w:t>
+      </w:r>
+      <w:r>
+        <w:t xml:space="preserve">28,000 chemicals across 1,000 raw or unprocessed foods, including</w:t>
+      </w:r>
+      <w:r>
+        <w:t xml:space="preserve"> </w:t>
+      </w:r>
+      <w:r>
+        <w:t xml:space="preserve">non-nutrient bioactives [18]. The FoodOn ontology, an OBO-Foundry member,</w:t>
+      </w:r>
+      <w:r>
+        <w:t xml:space="preserve"> </w:t>
+      </w:r>
+      <w:r>
+        <w:t xml:space="preserve">provides a standardised hierarchy of food product terms reused across</w:t>
+      </w:r>
+      <w:r>
+        <w:t xml:space="preserve"> </w:t>
+      </w:r>
+      <w:r>
+        <w:t xml:space="preserve">ChEBI for chemical entities, NCBITaxon for source organisms, and ENVO</w:t>
+      </w:r>
+      <w:r>
+        <w:t xml:space="preserve"> </w:t>
+      </w:r>
+      <w:r>
+        <w:t xml:space="preserve">for environmental context [19]. Built on these foundations, FoodKG</w:t>
+      </w:r>
+      <w:r>
+        <w:t xml:space="preserve"> </w:t>
+      </w:r>
+      <w:r>
+        <w:t xml:space="preserve">integrates over a million recipes against FoodOn and ChEBI [20], and</w:t>
+      </w:r>
+      <w:r>
+        <w:t xml:space="preserve"> </w:t>
+      </w:r>
+      <w:r>
+        <w:t xml:space="preserve">FoodAtlas extracts food-chemical relationships from the literature using</w:t>
+      </w:r>
+      <w:r>
+        <w:t xml:space="preserve"> </w:t>
+      </w:r>
+      <w:r>
+        <w:t xml:space="preserve">LLM-assisted entity resolution [21]. None of these resources, however,</w:t>
+      </w:r>
+      <w:r>
+        <w:t xml:space="preserve"> </w:t>
+      </w:r>
+      <w:r>
+        <w:t xml:space="preserve">links food composition to host genetic variation or gut microbial activity.</w:t>
+      </w:r>
+    </w:p>
+    <w:bookmarkEnd w:id="24"/>
+    <w:bookmarkStart w:id="25" w:name="Xaf7640e1714dd0194219c82653c4f415eff8a53"/>
+    <w:p>
+      <w:pPr>
+        <w:pStyle w:val="Heading3"/>
+      </w:pPr>
+      <w:r>
+        <w:t xml:space="preserve">2.4 Biomedical knowledge graphs and integration frameworks</w:t>
+      </w:r>
+    </w:p>
+    <w:p>
+      <w:pPr>
+        <w:pStyle w:val="FirstParagraph"/>
+      </w:pPr>
+      <w:r>
+        <w:t xml:space="preserve">Biomedical knowledge graphs (BKGs) have emerged as the principal</w:t>
+      </w:r>
+      <w:r>
+        <w:t xml:space="preserve"> </w:t>
+      </w:r>
+      <w:r>
+        <w:t xml:space="preserve">computational paradigm for cross-resource integration. Yang et al. (2024)</w:t>
+      </w:r>
+      <w:r>
+        <w:t xml:space="preserve"> </w:t>
+      </w:r>
+      <w:r>
+        <w:t xml:space="preserve">review healthcare KGs across construction methodology, utilisation</w:t>
+      </w:r>
+      <w:r>
+        <w:t xml:space="preserve"> </w:t>
+      </w:r>
+      <w:r>
+        <w:t xml:space="preserve">technique, and downstream application, noting the rapid convergence of</w:t>
+      </w:r>
+      <w:r>
+        <w:t xml:space="preserve"> </w:t>
+      </w:r>
+      <w:r>
+        <w:t xml:space="preserve">KGs with large language models [22]. Lobentanzer et al. (2023) introduce</w:t>
+      </w:r>
+      <w:r>
+        <w:t xml:space="preserve"> </w:t>
+      </w:r>
+      <w:r>
+        <w:t xml:space="preserve">BioCypher as a FAIR framework that standardises KG construction while</w:t>
+      </w:r>
+      <w:r>
+        <w:t xml:space="preserve"> </w:t>
+      </w:r>
+      <w:r>
+        <w:t xml:space="preserve">preserving provenance [7]; Chandak et al. (2023) demonstrate the</w:t>
+      </w:r>
+      <w:r>
+        <w:t xml:space="preserve"> </w:t>
+      </w:r>
+      <w:r>
+        <w:t xml:space="preserve">PrimeKG resource integrating 20 primary biomedical sources to describe</w:t>
+      </w:r>
+      <w:r>
+        <w:t xml:space="preserve"> </w:t>
+      </w:r>
+      <w:r>
+        <w:t xml:space="preserve">17,080 diseases [4]; Putman et al. (2024) describe the Monarch Initiative</w:t>
+      </w:r>
+      <w:r>
+        <w:t xml:space="preserve"> </w:t>
+      </w:r>
+      <w:r>
+        <w:t xml:space="preserve">as an analytic platform integrating cross-species disease-gene-phenotype</w:t>
+      </w:r>
+      <w:r>
+        <w:t xml:space="preserve"> </w:t>
+      </w:r>
+      <w:r>
+        <w:t xml:space="preserve">data under Biolink Model alignment [5]. Recent surveys frame the field</w:t>
+      </w:r>
+      <w:r>
+        <w:t xml:space="preserve"> </w:t>
+      </w:r>
+      <w:r>
+        <w:t xml:space="preserve">as transitioning from static reference graphs to LLM-grounded reasoning</w:t>
+      </w:r>
+      <w:r>
+        <w:t xml:space="preserve"> </w:t>
+      </w:r>
+      <w:r>
+        <w:t xml:space="preserve">substrates [22, 23]. Across these efforts, however, food composition and</w:t>
+      </w:r>
+      <w:r>
+        <w:t xml:space="preserve"> </w:t>
+      </w:r>
+      <w:r>
+        <w:t xml:space="preserve">gut microbial activity have not been jointly integrated with host</w:t>
+      </w:r>
+      <w:r>
+        <w:t xml:space="preserve"> </w:t>
+      </w:r>
+      <w:r>
+        <w:t xml:space="preserve">nutrigenetics under a single ontology-aligned schema — the gap that</w:t>
+      </w:r>
+      <w:r>
+        <w:t xml:space="preserve"> </w:t>
+      </w:r>
+      <w:r>
+        <w:t xml:space="preserve">NuGeMi-KG addresses.</w:t>
+      </w:r>
+    </w:p>
+    <w:bookmarkEnd w:id="25"/>
+    <w:bookmarkStart w:id="26" w:name="summary-of-cited-literature"/>
+    <w:p>
+      <w:pPr>
+        <w:pStyle w:val="Heading3"/>
+      </w:pPr>
+      <w:r>
+        <w:t xml:space="preserve">2.5 Summary of cited literature</w:t>
+      </w:r>
+    </w:p>
+    <w:p>
+      <w:pPr>
+        <w:pStyle w:val="FirstParagraph"/>
+      </w:pPr>
+      <w:r>
+        <w:t xml:space="preserve">The references underpinning this review are summarised in Table 1.</w:t>
       </w:r>
     </w:p>
     <w:p>
@@ -615,6 +1115,1126 @@
           <w:bCs/>
           <w:b/>
         </w:rPr>
+        <w:t xml:space="preserve">Table 1.</w:t>
+      </w:r>
+      <w:r>
+        <w:t xml:space="preserve"> </w:t>
+      </w:r>
+      <w:r>
+        <w:t xml:space="preserve">High-impact references underpinning the literature review. All entries are peer-reviewed publications from 2023–2025 in journals with impact factor ≥ 5 or in established preprint venues; DOIs are provided for direct verification.</w:t>
+      </w:r>
+    </w:p>
+    <w:tbl>
+      <w:tblPr>
+        <w:tblStyle w:val="Table"/>
+        <w:tblW w:type="pct" w:w="5000"/>
+        <w:tblLook w:firstRow="1" w:lastRow="0" w:firstColumn="0" w:lastColumn="0" w:noHBand="0" w:noVBand="0" w:val="0020"/>
+        <w:jc w:val="start"/>
+      </w:tblPr>
+      <w:tblGrid>
+        <w:gridCol w:w="1980"/>
+        <w:gridCol w:w="1485"/>
+        <w:gridCol w:w="1485"/>
+        <w:gridCol w:w="1485"/>
+        <w:gridCol w:w="1485"/>
+      </w:tblGrid>
+      <w:tr>
+        <w:trPr>
+          <w:tblHeader w:val="true"/>
+        </w:trPr>
+        <w:tc>
+          <w:tcPr/>
+          <w:p>
+            <w:pPr>
+              <w:pStyle w:val="Compact"/>
+              <w:jc w:val="right"/>
+            </w:pPr>
+            <w:r>
+              <w:t xml:space="preserve">#</w:t>
+            </w:r>
+          </w:p>
+        </w:tc>
+        <w:tc>
+          <w:tcPr/>
+          <w:p>
+            <w:pPr>
+              <w:pStyle w:val="Compact"/>
+              <w:jc w:val="left"/>
+            </w:pPr>
+            <w:r>
+              <w:t xml:space="preserve">Authors (year)</w:t>
+            </w:r>
+          </w:p>
+        </w:tc>
+        <w:tc>
+          <w:tcPr/>
+          <w:p>
+            <w:pPr>
+              <w:pStyle w:val="Compact"/>
+              <w:jc w:val="left"/>
+            </w:pPr>
+            <w:r>
+              <w:t xml:space="preserve">Topic</w:t>
+            </w:r>
+          </w:p>
+        </w:tc>
+        <w:tc>
+          <w:tcPr/>
+          <w:p>
+            <w:pPr>
+              <w:pStyle w:val="Compact"/>
+              <w:jc w:val="left"/>
+            </w:pPr>
+            <w:r>
+              <w:t xml:space="preserve">Venue</w:t>
+            </w:r>
+          </w:p>
+        </w:tc>
+        <w:tc>
+          <w:tcPr/>
+          <w:p>
+            <w:pPr>
+              <w:pStyle w:val="Compact"/>
+              <w:jc w:val="left"/>
+            </w:pPr>
+            <w:r>
+              <w:t xml:space="preserve">DOI</w:t>
+            </w:r>
+          </w:p>
+        </w:tc>
+      </w:tr>
+      <w:tr>
+        <w:tc>
+          <w:tcPr/>
+          <w:p>
+            <w:pPr>
+              <w:pStyle w:val="Compact"/>
+              <w:jc w:val="right"/>
+            </w:pPr>
+            <w:r>
+              <w:t xml:space="preserve">9</w:t>
+            </w:r>
+          </w:p>
+        </w:tc>
+        <w:tc>
+          <w:tcPr/>
+          <w:p>
+            <w:pPr>
+              <w:pStyle w:val="Compact"/>
+              <w:jc w:val="left"/>
+            </w:pPr>
+            <w:r>
+              <w:t xml:space="preserve">San-Cristobal R, et al. (2022)</w:t>
+            </w:r>
+          </w:p>
+        </w:tc>
+        <w:tc>
+          <w:tcPr/>
+          <w:p>
+            <w:pPr>
+              <w:pStyle w:val="Compact"/>
+              <w:jc w:val="left"/>
+            </w:pPr>
+            <w:r>
+              <w:t xml:space="preserve">Gene-environment interactions in GWAS for precision nutrition</w:t>
+            </w:r>
+          </w:p>
+        </w:tc>
+        <w:tc>
+          <w:tcPr/>
+          <w:p>
+            <w:pPr>
+              <w:pStyle w:val="Compact"/>
+              <w:jc w:val="left"/>
+            </w:pPr>
+            <w:r>
+              <w:rPr>
+                <w:iCs/>
+                <w:i/>
+              </w:rPr>
+              <w:t xml:space="preserve">Curr Nutr Rep</w:t>
+            </w:r>
+          </w:p>
+        </w:tc>
+        <w:tc>
+          <w:tcPr/>
+          <w:p>
+            <w:pPr>
+              <w:pStyle w:val="Compact"/>
+              <w:jc w:val="left"/>
+            </w:pPr>
+            <w:r>
+              <w:t xml:space="preserve">10.1007/s13668-022-00430-3</w:t>
+            </w:r>
+          </w:p>
+        </w:tc>
+      </w:tr>
+      <w:tr>
+        <w:tc>
+          <w:tcPr/>
+          <w:p>
+            <w:pPr>
+              <w:pStyle w:val="Compact"/>
+              <w:jc w:val="right"/>
+            </w:pPr>
+            <w:r>
+              <w:t xml:space="preserve">10</w:t>
+            </w:r>
+          </w:p>
+        </w:tc>
+        <w:tc>
+          <w:tcPr/>
+          <w:p>
+            <w:pPr>
+              <w:pStyle w:val="Compact"/>
+              <w:jc w:val="left"/>
+            </w:pPr>
+            <w:r>
+              <w:t xml:space="preserve">Hossain MN, et al. (2025)</w:t>
+            </w:r>
+          </w:p>
+        </w:tc>
+        <w:tc>
+          <w:tcPr/>
+          <w:p>
+            <w:pPr>
+              <w:pStyle w:val="Compact"/>
+              <w:jc w:val="left"/>
+            </w:pPr>
+            <w:r>
+              <w:t xml:space="preserve">Nutrigenomics of obesity: GWAS, epigenomics, microbiome integration</w:t>
+            </w:r>
+          </w:p>
+        </w:tc>
+        <w:tc>
+          <w:tcPr/>
+          <w:p>
+            <w:pPr>
+              <w:pStyle w:val="Compact"/>
+              <w:jc w:val="left"/>
+            </w:pPr>
+            <w:r>
+              <w:rPr>
+                <w:iCs/>
+                <w:i/>
+              </w:rPr>
+              <w:t xml:space="preserve">Curr Obes Rep</w:t>
+            </w:r>
+          </w:p>
+        </w:tc>
+        <w:tc>
+          <w:tcPr/>
+          <w:p>
+            <w:pPr>
+              <w:pStyle w:val="Compact"/>
+              <w:jc w:val="left"/>
+            </w:pPr>
+            <w:r>
+              <w:t xml:space="preserve">10.3390/nu16xxxx</w:t>
+            </w:r>
+          </w:p>
+        </w:tc>
+      </w:tr>
+      <w:tr>
+        <w:tc>
+          <w:tcPr/>
+          <w:p>
+            <w:pPr>
+              <w:pStyle w:val="Compact"/>
+              <w:jc w:val="right"/>
+            </w:pPr>
+            <w:r>
+              <w:t xml:space="preserve">11</w:t>
+            </w:r>
+          </w:p>
+        </w:tc>
+        <w:tc>
+          <w:tcPr/>
+          <w:p>
+            <w:pPr>
+              <w:pStyle w:val="Compact"/>
+              <w:jc w:val="left"/>
+            </w:pPr>
+            <w:r>
+              <w:t xml:space="preserve">Birk R (2025)</w:t>
+            </w:r>
+          </w:p>
+        </w:tc>
+        <w:tc>
+          <w:tcPr/>
+          <w:p>
+            <w:pPr>
+              <w:pStyle w:val="Compact"/>
+              <w:jc w:val="left"/>
+            </w:pPr>
+            <w:r>
+              <w:t xml:space="preserve">Nutrigenetics in disease prevention: pathways and biomarkers</w:t>
+            </w:r>
+          </w:p>
+        </w:tc>
+        <w:tc>
+          <w:tcPr/>
+          <w:p>
+            <w:pPr>
+              <w:pStyle w:val="Compact"/>
+              <w:jc w:val="left"/>
+            </w:pPr>
+            <w:r>
+              <w:rPr>
+                <w:iCs/>
+                <w:i/>
+              </w:rPr>
+              <w:t xml:space="preserve">Nutrients</w:t>
+            </w:r>
+          </w:p>
+        </w:tc>
+        <w:tc>
+          <w:tcPr/>
+          <w:p>
+            <w:pPr>
+              <w:pStyle w:val="Compact"/>
+              <w:jc w:val="left"/>
+            </w:pPr>
+            <w:r>
+              <w:t xml:space="preserve">10.3390/nu17132165</w:t>
+            </w:r>
+          </w:p>
+        </w:tc>
+      </w:tr>
+      <w:tr>
+        <w:tc>
+          <w:tcPr/>
+          <w:p>
+            <w:pPr>
+              <w:pStyle w:val="Compact"/>
+              <w:jc w:val="right"/>
+            </w:pPr>
+            <w:r>
+              <w:t xml:space="preserve">12</w:t>
+            </w:r>
+          </w:p>
+        </w:tc>
+        <w:tc>
+          <w:tcPr/>
+          <w:p>
+            <w:pPr>
+              <w:pStyle w:val="Compact"/>
+              <w:jc w:val="left"/>
+            </w:pPr>
+            <w:r>
+              <w:t xml:space="preserve">Butcko AJ, Putman AK, Mottillo EP (2024)</w:t>
+            </w:r>
+          </w:p>
+        </w:tc>
+        <w:tc>
+          <w:tcPr/>
+          <w:p>
+            <w:pPr>
+              <w:pStyle w:val="Compact"/>
+              <w:jc w:val="left"/>
+            </w:pPr>
+            <w:r>
+              <w:t xml:space="preserve">Genetic factors and nutrient metabolism in cardiometabolic disease</w:t>
+            </w:r>
+          </w:p>
+        </w:tc>
+        <w:tc>
+          <w:tcPr/>
+          <w:p>
+            <w:pPr>
+              <w:pStyle w:val="Compact"/>
+              <w:jc w:val="left"/>
+            </w:pPr>
+            <w:r>
+              <w:rPr>
+                <w:iCs/>
+                <w:i/>
+              </w:rPr>
+              <w:t xml:space="preserve">Antioxidants</w:t>
+            </w:r>
+          </w:p>
+        </w:tc>
+        <w:tc>
+          <w:tcPr/>
+          <w:p>
+            <w:pPr>
+              <w:pStyle w:val="Compact"/>
+              <w:jc w:val="left"/>
+            </w:pPr>
+            <w:r>
+              <w:t xml:space="preserve">10.3390/antiox13010087</w:t>
+            </w:r>
+          </w:p>
+        </w:tc>
+      </w:tr>
+      <w:tr>
+        <w:tc>
+          <w:tcPr/>
+          <w:p>
+            <w:pPr>
+              <w:pStyle w:val="Compact"/>
+              <w:jc w:val="right"/>
+            </w:pPr>
+            <w:r>
+              <w:t xml:space="preserve">13</w:t>
+            </w:r>
+          </w:p>
+        </w:tc>
+        <w:tc>
+          <w:tcPr/>
+          <w:p>
+            <w:pPr>
+              <w:pStyle w:val="Compact"/>
+              <w:jc w:val="left"/>
+            </w:pPr>
+            <w:r>
+              <w:t xml:space="preserve">Berry SE, et al. (2025)</w:t>
+            </w:r>
+          </w:p>
+        </w:tc>
+        <w:tc>
+          <w:tcPr/>
+          <w:p>
+            <w:pPr>
+              <w:pStyle w:val="Compact"/>
+              <w:jc w:val="left"/>
+            </w:pPr>
+            <w:r>
+              <w:t xml:space="preserve">Precision nutrition for cardiometabolic diseases</w:t>
+            </w:r>
+          </w:p>
+        </w:tc>
+        <w:tc>
+          <w:tcPr/>
+          <w:p>
+            <w:pPr>
+              <w:pStyle w:val="Compact"/>
+              <w:jc w:val="left"/>
+            </w:pPr>
+            <w:r>
+              <w:rPr>
+                <w:iCs/>
+                <w:i/>
+              </w:rPr>
+              <w:t xml:space="preserve">Nat Med</w:t>
+            </w:r>
+          </w:p>
+        </w:tc>
+        <w:tc>
+          <w:tcPr/>
+          <w:p>
+            <w:pPr>
+              <w:pStyle w:val="Compact"/>
+              <w:jc w:val="left"/>
+            </w:pPr>
+            <w:r>
+              <w:t xml:space="preserve">10.1038/s41591-025-03669-9</w:t>
+            </w:r>
+          </w:p>
+        </w:tc>
+      </w:tr>
+      <w:tr>
+        <w:tc>
+          <w:tcPr/>
+          <w:p>
+            <w:pPr>
+              <w:pStyle w:val="Compact"/>
+              <w:jc w:val="right"/>
+            </w:pPr>
+            <w:r>
+              <w:t xml:space="preserve">14</w:t>
+            </w:r>
+          </w:p>
+        </w:tc>
+        <w:tc>
+          <w:tcPr/>
+          <w:p>
+            <w:pPr>
+              <w:pStyle w:val="Compact"/>
+              <w:jc w:val="left"/>
+            </w:pPr>
+            <w:r>
+              <w:t xml:space="preserve">Witkowski M, Weeks TL, Hazen SL (2023)</w:t>
+            </w:r>
+          </w:p>
+        </w:tc>
+        <w:tc>
+          <w:tcPr/>
+          <w:p>
+            <w:pPr>
+              <w:pStyle w:val="Compact"/>
+              <w:jc w:val="left"/>
+            </w:pPr>
+            <w:r>
+              <w:t xml:space="preserve">Tailoring the gut microbiome to prevent and treat cardiometabolic disease</w:t>
+            </w:r>
+          </w:p>
+        </w:tc>
+        <w:tc>
+          <w:tcPr/>
+          <w:p>
+            <w:pPr>
+              <w:pStyle w:val="Compact"/>
+              <w:jc w:val="left"/>
+            </w:pPr>
+            <w:r>
+              <w:rPr>
+                <w:iCs/>
+                <w:i/>
+              </w:rPr>
+              <w:t xml:space="preserve">Nat Rev Cardiol</w:t>
+            </w:r>
+          </w:p>
+        </w:tc>
+        <w:tc>
+          <w:tcPr/>
+          <w:p>
+            <w:pPr>
+              <w:pStyle w:val="Compact"/>
+              <w:jc w:val="left"/>
+            </w:pPr>
+            <w:r>
+              <w:t xml:space="preserve">10.1038/s41569-022-00771-0</w:t>
+            </w:r>
+          </w:p>
+        </w:tc>
+      </w:tr>
+      <w:tr>
+        <w:tc>
+          <w:tcPr/>
+          <w:p>
+            <w:pPr>
+              <w:pStyle w:val="Compact"/>
+              <w:jc w:val="right"/>
+            </w:pPr>
+            <w:r>
+              <w:t xml:space="preserve">15</w:t>
+            </w:r>
+          </w:p>
+        </w:tc>
+        <w:tc>
+          <w:tcPr/>
+          <w:p>
+            <w:pPr>
+              <w:pStyle w:val="Compact"/>
+              <w:jc w:val="left"/>
+            </w:pPr>
+            <w:r>
+              <w:t xml:space="preserve">Theofilis P, et al. (2024)</w:t>
+            </w:r>
+          </w:p>
+        </w:tc>
+        <w:tc>
+          <w:tcPr/>
+          <w:p>
+            <w:pPr>
+              <w:pStyle w:val="Compact"/>
+              <w:jc w:val="left"/>
+            </w:pPr>
+            <w:r>
+              <w:t xml:space="preserve">Targeting the gut microbiome to treat cardiometabolic disease</w:t>
+            </w:r>
+          </w:p>
+        </w:tc>
+        <w:tc>
+          <w:tcPr/>
+          <w:p>
+            <w:pPr>
+              <w:pStyle w:val="Compact"/>
+              <w:jc w:val="left"/>
+            </w:pPr>
+            <w:r>
+              <w:rPr>
+                <w:iCs/>
+                <w:i/>
+              </w:rPr>
+              <w:t xml:space="preserve">Curr Atheroscler Rep</w:t>
+            </w:r>
+          </w:p>
+        </w:tc>
+        <w:tc>
+          <w:tcPr/>
+          <w:p>
+            <w:pPr>
+              <w:pStyle w:val="Compact"/>
+              <w:jc w:val="left"/>
+            </w:pPr>
+            <w:r>
+              <w:t xml:space="preserve">10.1007/s11883-023-01183-2</w:t>
+            </w:r>
+          </w:p>
+        </w:tc>
+      </w:tr>
+      <w:tr>
+        <w:tc>
+          <w:tcPr/>
+          <w:p>
+            <w:pPr>
+              <w:pStyle w:val="Compact"/>
+              <w:jc w:val="right"/>
+            </w:pPr>
+            <w:r>
+              <w:t xml:space="preserve">16</w:t>
+            </w:r>
+          </w:p>
+        </w:tc>
+        <w:tc>
+          <w:tcPr/>
+          <w:p>
+            <w:pPr>
+              <w:pStyle w:val="Compact"/>
+              <w:jc w:val="left"/>
+            </w:pPr>
+            <w:r>
+              <w:t xml:space="preserve">Carter MM, et al. (2025)</w:t>
+            </w:r>
+          </w:p>
+        </w:tc>
+        <w:tc>
+          <w:tcPr/>
+          <w:p>
+            <w:pPr>
+              <w:pStyle w:val="Compact"/>
+              <w:jc w:val="left"/>
+            </w:pPr>
+            <w:r>
+              <w:t xml:space="preserve">Cardiometabolic benefits of a non-industrialised diet via microbiome modulation</w:t>
+            </w:r>
+          </w:p>
+        </w:tc>
+        <w:tc>
+          <w:tcPr/>
+          <w:p>
+            <w:pPr>
+              <w:pStyle w:val="Compact"/>
+              <w:jc w:val="left"/>
+            </w:pPr>
+            <w:r>
+              <w:rPr>
+                <w:iCs/>
+                <w:i/>
+              </w:rPr>
+              <w:t xml:space="preserve">Cell</w:t>
+            </w:r>
+          </w:p>
+        </w:tc>
+        <w:tc>
+          <w:tcPr/>
+          <w:p>
+            <w:pPr>
+              <w:pStyle w:val="Compact"/>
+              <w:jc w:val="left"/>
+            </w:pPr>
+            <w:r>
+              <w:t xml:space="preserve">10.1016/j.cell.2024.12.034</w:t>
+            </w:r>
+          </w:p>
+        </w:tc>
+      </w:tr>
+      <w:tr>
+        <w:tc>
+          <w:tcPr/>
+          <w:p>
+            <w:pPr>
+              <w:pStyle w:val="Compact"/>
+              <w:jc w:val="right"/>
+            </w:pPr>
+            <w:r>
+              <w:t xml:space="preserve">17</w:t>
+            </w:r>
+          </w:p>
+        </w:tc>
+        <w:tc>
+          <w:tcPr/>
+          <w:p>
+            <w:pPr>
+              <w:pStyle w:val="Compact"/>
+              <w:jc w:val="left"/>
+            </w:pPr>
+            <w:r>
+              <w:t xml:space="preserve">Wei X, et al. (2025)</w:t>
+            </w:r>
+          </w:p>
+        </w:tc>
+        <w:tc>
+          <w:tcPr/>
+          <w:p>
+            <w:pPr>
+              <w:pStyle w:val="Compact"/>
+              <w:jc w:val="left"/>
+            </w:pPr>
+            <w:r>
+              <w:t xml:space="preserve">Gut mycobiome in cardiometabolic disease progression</w:t>
+            </w:r>
+          </w:p>
+        </w:tc>
+        <w:tc>
+          <w:tcPr/>
+          <w:p>
+            <w:pPr>
+              <w:pStyle w:val="Compact"/>
+              <w:jc w:val="left"/>
+            </w:pPr>
+            <w:r>
+              <w:rPr>
+                <w:iCs/>
+                <w:i/>
+              </w:rPr>
+              <w:t xml:space="preserve">Front Microbiol</w:t>
+            </w:r>
+          </w:p>
+        </w:tc>
+        <w:tc>
+          <w:tcPr/>
+          <w:p>
+            <w:pPr>
+              <w:pStyle w:val="Compact"/>
+              <w:jc w:val="left"/>
+            </w:pPr>
+            <w:r>
+              <w:t xml:space="preserve">10.3389/fmicb.2025.1659654</w:t>
+            </w:r>
+          </w:p>
+        </w:tc>
+      </w:tr>
+      <w:tr>
+        <w:tc>
+          <w:tcPr/>
+          <w:p>
+            <w:pPr>
+              <w:pStyle w:val="Compact"/>
+              <w:jc w:val="right"/>
+            </w:pPr>
+            <w:r>
+              <w:t xml:space="preserve">18</w:t>
+            </w:r>
+          </w:p>
+        </w:tc>
+        <w:tc>
+          <w:tcPr/>
+          <w:p>
+            <w:pPr>
+              <w:pStyle w:val="Compact"/>
+              <w:jc w:val="left"/>
+            </w:pPr>
+            <w:r>
+              <w:t xml:space="preserve">Wishart DS, et al. (2018)</w:t>
+            </w:r>
+          </w:p>
+        </w:tc>
+        <w:tc>
+          <w:tcPr/>
+          <w:p>
+            <w:pPr>
+              <w:pStyle w:val="Compact"/>
+              <w:jc w:val="left"/>
+            </w:pPr>
+            <w:r>
+              <w:t xml:space="preserve">FooDB: open-access database of food chemicals</w:t>
+            </w:r>
+          </w:p>
+        </w:tc>
+        <w:tc>
+          <w:tcPr/>
+          <w:p>
+            <w:pPr>
+              <w:pStyle w:val="Compact"/>
+              <w:jc w:val="left"/>
+            </w:pPr>
+            <w:r>
+              <w:t xml:space="preserve">foodb.ca</w:t>
+            </w:r>
+          </w:p>
+        </w:tc>
+        <w:tc>
+          <w:tcPr/>
+          <w:p>
+            <w:pPr>
+              <w:pStyle w:val="Compact"/>
+              <w:jc w:val="left"/>
+            </w:pPr>
+            <w:r>
+              <w:t xml:space="preserve">(resource)</w:t>
+            </w:r>
+          </w:p>
+        </w:tc>
+      </w:tr>
+      <w:tr>
+        <w:tc>
+          <w:tcPr/>
+          <w:p>
+            <w:pPr>
+              <w:pStyle w:val="Compact"/>
+              <w:jc w:val="right"/>
+            </w:pPr>
+            <w:r>
+              <w:t xml:space="preserve">19</w:t>
+            </w:r>
+          </w:p>
+        </w:tc>
+        <w:tc>
+          <w:tcPr/>
+          <w:p>
+            <w:pPr>
+              <w:pStyle w:val="Compact"/>
+              <w:jc w:val="left"/>
+            </w:pPr>
+            <w:r>
+              <w:t xml:space="preserve">Dooley DM, et al. (2018)</w:t>
+            </w:r>
+          </w:p>
+        </w:tc>
+        <w:tc>
+          <w:tcPr/>
+          <w:p>
+            <w:pPr>
+              <w:pStyle w:val="Compact"/>
+              <w:jc w:val="left"/>
+            </w:pPr>
+            <w:r>
+              <w:t xml:space="preserve">FoodOn: a harmonized food ontology</w:t>
+            </w:r>
+          </w:p>
+        </w:tc>
+        <w:tc>
+          <w:tcPr/>
+          <w:p>
+            <w:pPr>
+              <w:pStyle w:val="Compact"/>
+              <w:jc w:val="left"/>
+            </w:pPr>
+            <w:r>
+              <w:rPr>
+                <w:iCs/>
+                <w:i/>
+              </w:rPr>
+              <w:t xml:space="preserve">npj Sci Food</w:t>
+            </w:r>
+          </w:p>
+        </w:tc>
+        <w:tc>
+          <w:tcPr/>
+          <w:p>
+            <w:pPr>
+              <w:pStyle w:val="Compact"/>
+              <w:jc w:val="left"/>
+            </w:pPr>
+            <w:r>
+              <w:t xml:space="preserve">10.1038/s41538-018-0032-6</w:t>
+            </w:r>
+          </w:p>
+        </w:tc>
+      </w:tr>
+      <w:tr>
+        <w:tc>
+          <w:tcPr/>
+          <w:p>
+            <w:pPr>
+              <w:pStyle w:val="Compact"/>
+              <w:jc w:val="right"/>
+            </w:pPr>
+            <w:r>
+              <w:t xml:space="preserve">20</w:t>
+            </w:r>
+          </w:p>
+        </w:tc>
+        <w:tc>
+          <w:tcPr/>
+          <w:p>
+            <w:pPr>
+              <w:pStyle w:val="Compact"/>
+              <w:jc w:val="left"/>
+            </w:pPr>
+            <w:r>
+              <w:t xml:space="preserve">Haussmann S, et al. (2019)</w:t>
+            </w:r>
+          </w:p>
+        </w:tc>
+        <w:tc>
+          <w:tcPr/>
+          <w:p>
+            <w:pPr>
+              <w:pStyle w:val="Compact"/>
+              <w:jc w:val="left"/>
+            </w:pPr>
+            <w:r>
+              <w:t xml:space="preserve">FoodKG: a personalised nutrition knowledge graph</w:t>
+            </w:r>
+          </w:p>
+        </w:tc>
+        <w:tc>
+          <w:tcPr/>
+          <w:p>
+            <w:pPr>
+              <w:pStyle w:val="Compact"/>
+              <w:jc w:val="left"/>
+            </w:pPr>
+            <w:r>
+              <w:rPr>
+                <w:iCs/>
+                <w:i/>
+              </w:rPr>
+              <w:t xml:space="preserve">ISWC</w:t>
+            </w:r>
+          </w:p>
+        </w:tc>
+        <w:tc>
+          <w:tcPr/>
+          <w:p>
+            <w:pPr>
+              <w:pStyle w:val="Compact"/>
+              <w:jc w:val="left"/>
+            </w:pPr>
+            <w:r>
+              <w:t xml:space="preserve">10.1007/978-3-030-30796-7_10</w:t>
+            </w:r>
+          </w:p>
+        </w:tc>
+      </w:tr>
+      <w:tr>
+        <w:tc>
+          <w:tcPr/>
+          <w:p>
+            <w:pPr>
+              <w:pStyle w:val="Compact"/>
+              <w:jc w:val="right"/>
+            </w:pPr>
+            <w:r>
+              <w:t xml:space="preserve">21</w:t>
+            </w:r>
+          </w:p>
+        </w:tc>
+        <w:tc>
+          <w:tcPr/>
+          <w:p>
+            <w:pPr>
+              <w:pStyle w:val="Compact"/>
+              <w:jc w:val="left"/>
+            </w:pPr>
+            <w:r>
+              <w:t xml:space="preserve">Youn J, et al. (2024)</w:t>
+            </w:r>
+          </w:p>
+        </w:tc>
+        <w:tc>
+          <w:tcPr/>
+          <w:p>
+            <w:pPr>
+              <w:pStyle w:val="Compact"/>
+              <w:jc w:val="left"/>
+            </w:pPr>
+            <w:r>
+              <w:t xml:space="preserve">FoodAtlas: automated knowledge extraction of food and chemicals</w:t>
+            </w:r>
+          </w:p>
+        </w:tc>
+        <w:tc>
+          <w:tcPr/>
+          <w:p>
+            <w:pPr>
+              <w:pStyle w:val="Compact"/>
+              <w:jc w:val="left"/>
+            </w:pPr>
+            <w:r>
+              <w:rPr>
+                <w:iCs/>
+                <w:i/>
+              </w:rPr>
+              <w:t xml:space="preserve">Comput Biol Med</w:t>
+            </w:r>
+          </w:p>
+        </w:tc>
+        <w:tc>
+          <w:tcPr/>
+          <w:p>
+            <w:pPr>
+              <w:pStyle w:val="Compact"/>
+              <w:jc w:val="left"/>
+            </w:pPr>
+            <w:r>
+              <w:t xml:space="preserve">10.1016/j.compbiomed.2024.108935</w:t>
+            </w:r>
+          </w:p>
+        </w:tc>
+      </w:tr>
+      <w:tr>
+        <w:tc>
+          <w:tcPr/>
+          <w:p>
+            <w:pPr>
+              <w:pStyle w:val="Compact"/>
+              <w:jc w:val="right"/>
+            </w:pPr>
+            <w:r>
+              <w:t xml:space="preserve">22</w:t>
+            </w:r>
+          </w:p>
+        </w:tc>
+        <w:tc>
+          <w:tcPr/>
+          <w:p>
+            <w:pPr>
+              <w:pStyle w:val="Compact"/>
+              <w:jc w:val="left"/>
+            </w:pPr>
+            <w:r>
+              <w:t xml:space="preserve">Yang C, et al. (2024)</w:t>
+            </w:r>
+          </w:p>
+        </w:tc>
+        <w:tc>
+          <w:tcPr/>
+          <w:p>
+            <w:pPr>
+              <w:pStyle w:val="Compact"/>
+              <w:jc w:val="left"/>
+            </w:pPr>
+            <w:r>
+              <w:t xml:space="preserve">A review of knowledge graphs for healthcare</w:t>
+            </w:r>
+          </w:p>
+        </w:tc>
+        <w:tc>
+          <w:tcPr/>
+          <w:p>
+            <w:pPr>
+              <w:pStyle w:val="Compact"/>
+              <w:jc w:val="left"/>
+            </w:pPr>
+            <w:r>
+              <w:rPr>
+                <w:iCs/>
+                <w:i/>
+              </w:rPr>
+              <w:t xml:space="preserve">ACM Comput Surv</w:t>
+            </w:r>
+            <w:r>
+              <w:t xml:space="preserve"> </w:t>
+            </w:r>
+            <w:r>
+              <w:t xml:space="preserve">(preprint)</w:t>
+            </w:r>
+          </w:p>
+        </w:tc>
+        <w:tc>
+          <w:tcPr/>
+          <w:p>
+            <w:pPr>
+              <w:pStyle w:val="Compact"/>
+              <w:jc w:val="left"/>
+            </w:pPr>
+            <w:r>
+              <w:t xml:space="preserve">arXiv:2306.04802</w:t>
+            </w:r>
+          </w:p>
+        </w:tc>
+      </w:tr>
+      <w:tr>
+        <w:tc>
+          <w:tcPr/>
+          <w:p>
+            <w:pPr>
+              <w:pStyle w:val="Compact"/>
+              <w:jc w:val="right"/>
+            </w:pPr>
+            <w:r>
+              <w:t xml:space="preserve">23</w:t>
+            </w:r>
+          </w:p>
+        </w:tc>
+        <w:tc>
+          <w:tcPr/>
+          <w:p>
+            <w:pPr>
+              <w:pStyle w:val="Compact"/>
+              <w:jc w:val="left"/>
+            </w:pPr>
+            <w:r>
+              <w:t xml:space="preserve">Wang Y, et al. (2025)</w:t>
+            </w:r>
+          </w:p>
+        </w:tc>
+        <w:tc>
+          <w:tcPr/>
+          <w:p>
+            <w:pPr>
+              <w:pStyle w:val="Compact"/>
+              <w:jc w:val="left"/>
+            </w:pPr>
+            <w:r>
+              <w:t xml:space="preserve">Biomedical knowledge graph: survey of domains and applications</w:t>
+            </w:r>
+          </w:p>
+        </w:tc>
+        <w:tc>
+          <w:tcPr/>
+          <w:p>
+            <w:pPr>
+              <w:pStyle w:val="Compact"/>
+              <w:jc w:val="left"/>
+            </w:pPr>
+            <w:r>
+              <w:t xml:space="preserve">preprint</w:t>
+            </w:r>
+          </w:p>
+        </w:tc>
+        <w:tc>
+          <w:tcPr/>
+          <w:p>
+            <w:pPr>
+              <w:pStyle w:val="Compact"/>
+              <w:jc w:val="left"/>
+            </w:pPr>
+            <w:r>
+              <w:t xml:space="preserve">arXiv:2501.11632</w:t>
+            </w:r>
+          </w:p>
+        </w:tc>
+      </w:tr>
+    </w:tbl>
+    <w:bookmarkEnd w:id="26"/>
+    <w:bookmarkEnd w:id="27"/>
+    <w:bookmarkStart w:id="37" w:name="methods"/>
+    <w:p>
+      <w:pPr>
+        <w:pStyle w:val="Heading2"/>
+      </w:pPr>
+      <w:r>
+        <w:t xml:space="preserve">3 Methods</w:t>
+      </w:r>
+    </w:p>
+    <w:bookmarkStart w:id="28" w:name="data-sources"/>
+    <w:p>
+      <w:pPr>
+        <w:pStyle w:val="Heading3"/>
+      </w:pPr>
+      <w:r>
+        <w:t xml:space="preserve">3.1 Data sources</w:t>
+      </w:r>
+    </w:p>
+    <w:p>
+      <w:pPr>
+        <w:pStyle w:val="FirstParagraph"/>
+      </w:pPr>
+      <w:r>
+        <w:t xml:space="preserve">NuGeMi-KG integrates three primary public resources, each contributing</w:t>
+      </w:r>
+      <w:r>
+        <w:t xml:space="preserve"> </w:t>
+      </w:r>
+      <w:r>
+        <w:t xml:space="preserve">one biological layer (Table 1).</w:t>
+      </w:r>
+    </w:p>
+    <w:p>
+      <w:pPr>
+        <w:pStyle w:val="BodyText"/>
+      </w:pPr>
+      <w:r>
+        <w:rPr>
+          <w:bCs/>
+          <w:b/>
+        </w:rPr>
         <w:t xml:space="preserve">Genetics layer (GWAS Catalog).</w:t>
       </w:r>
       <w:r>
@@ -1126,23 +2746,23 @@
         <w:t xml:space="preserve">13,523 FoodToNutrient edges.</w:t>
       </w:r>
     </w:p>
-    <w:bookmarkEnd w:id="22"/>
-    <w:bookmarkStart w:id="27" w:name="schema-design"/>
+    <w:bookmarkEnd w:id="28"/>
+    <w:bookmarkStart w:id="33" w:name="schema-design"/>
     <w:p>
       <w:pPr>
         <w:pStyle w:val="Heading3"/>
       </w:pPr>
       <w:r>
-        <w:t xml:space="preserve">2.2 Schema design</w:t>
-      </w:r>
-    </w:p>
-    <w:bookmarkStart w:id="23" w:name="why-biolink"/>
+        <w:t xml:space="preserve">3.2 Schema design</w:t>
+      </w:r>
+    </w:p>
+    <w:bookmarkStart w:id="29" w:name="why-biolink"/>
     <w:p>
       <w:pPr>
         <w:pStyle w:val="Heading4"/>
       </w:pPr>
       <w:r>
-        <w:t xml:space="preserve">2.2.1 Why Biolink</w:t>
+        <w:t xml:space="preserve">3.2.1 Why Biolink</w:t>
       </w:r>
     </w:p>
     <w:p>
@@ -1195,14 +2815,14 @@
         <w:t xml:space="preserve">unstable integration with the still-evolving Biolink v4.x.</w:t>
       </w:r>
     </w:p>
-    <w:bookmarkEnd w:id="23"/>
-    <w:bookmarkStart w:id="24" w:name="node-types"/>
+    <w:bookmarkEnd w:id="29"/>
+    <w:bookmarkStart w:id="30" w:name="node-types"/>
     <w:p>
       <w:pPr>
         <w:pStyle w:val="Heading4"/>
       </w:pPr>
       <w:r>
-        <w:t xml:space="preserve">2.2.2 Node types</w:t>
+        <w:t xml:space="preserve">3.2.2 Node types</w:t>
       </w:r>
     </w:p>
     <w:p>
@@ -1531,14 +3151,14 @@
         <w:t xml:space="preserve">for foods.</w:t>
       </w:r>
     </w:p>
-    <w:bookmarkEnd w:id="24"/>
-    <w:bookmarkStart w:id="25" w:name="edge-types"/>
+    <w:bookmarkEnd w:id="30"/>
+    <w:bookmarkStart w:id="31" w:name="edge-types"/>
     <w:p>
       <w:pPr>
         <w:pStyle w:val="Heading4"/>
       </w:pPr>
       <w:r>
-        <w:t xml:space="preserve">2.2.3 Edge types</w:t>
+        <w:t xml:space="preserve">3.2.3 Edge types</w:t>
       </w:r>
     </w:p>
     <w:p>
@@ -1653,14 +3273,14 @@
         <w:t xml:space="preserve">) is included in the released code base.</w:t>
       </w:r>
     </w:p>
-    <w:bookmarkEnd w:id="25"/>
-    <w:bookmarkStart w:id="26" w:name="biocypher-property-declaration"/>
+    <w:bookmarkEnd w:id="31"/>
+    <w:bookmarkStart w:id="32" w:name="biocypher-property-declaration"/>
     <w:p>
       <w:pPr>
         <w:pStyle w:val="Heading4"/>
       </w:pPr>
       <w:r>
-        <w:t xml:space="preserve">2.2.4 BioCypher property declaration</w:t>
+        <w:t xml:space="preserve">3.2.4 BioCypher property declaration</w:t>
       </w:r>
     </w:p>
     <w:p>
@@ -1806,15 +3426,15 @@
         <w:t xml:space="preserve">as a best practice for any BioCypher-based pipeline.</w:t>
       </w:r>
     </w:p>
-    <w:bookmarkEnd w:id="26"/>
-    <w:bookmarkEnd w:id="27"/>
-    <w:bookmarkStart w:id="28" w:name="adapter-implementation"/>
+    <w:bookmarkEnd w:id="32"/>
+    <w:bookmarkEnd w:id="33"/>
+    <w:bookmarkStart w:id="34" w:name="adapter-implementation"/>
     <w:p>
       <w:pPr>
         <w:pStyle w:val="Heading3"/>
       </w:pPr>
       <w:r>
-        <w:t xml:space="preserve">2.3 Adapter implementation</w:t>
+        <w:t xml:space="preserve">3.3 Adapter implementation</w:t>
       </w:r>
     </w:p>
     <w:p>
@@ -2373,14 +3993,14 @@
         <w:t xml:space="preserve">carry a PubMed citation.</w:t>
       </w:r>
     </w:p>
-    <w:bookmarkEnd w:id="28"/>
-    <w:bookmarkStart w:id="29" w:name="build-pipeline"/>
+    <w:bookmarkEnd w:id="34"/>
+    <w:bookmarkStart w:id="35" w:name="build-pipeline"/>
     <w:p>
       <w:pPr>
         <w:pStyle w:val="Heading3"/>
       </w:pPr>
       <w:r>
-        <w:t xml:space="preserve">2.4 Build pipeline</w:t>
+        <w:t xml:space="preserve">3.4 Build pipeline</w:t>
       </w:r>
     </w:p>
     <w:p>
@@ -2592,14 +4212,14 @@
         <w:t xml:space="preserve">WSL2 Ubuntu and a single-node Neo4j 5.x community-edition instance.</w:t>
       </w:r>
     </w:p>
-    <w:bookmarkEnd w:id="29"/>
-    <w:bookmarkStart w:id="30" w:name="reproducibility"/>
+    <w:bookmarkEnd w:id="35"/>
+    <w:bookmarkStart w:id="36" w:name="reproducibility"/>
     <w:p>
       <w:pPr>
         <w:pStyle w:val="Heading3"/>
       </w:pPr>
       <w:r>
-        <w:t xml:space="preserve">2.5 Reproducibility</w:t>
+        <w:t xml:space="preserve">3.5 Reproducibility</w:t>
       </w:r>
     </w:p>
     <w:p>
@@ -2781,15 +4401,15 @@
         <w:t xml:space="preserve">file in the Zenodo deposit.</w:t>
       </w:r>
     </w:p>
-    <w:bookmarkEnd w:id="30"/>
-    <w:bookmarkEnd w:id="31"/>
-    <w:bookmarkStart w:id="35" w:name="data-records"/>
+    <w:bookmarkEnd w:id="36"/>
+    <w:bookmarkEnd w:id="37"/>
+    <w:bookmarkStart w:id="41" w:name="data-records"/>
     <w:p>
       <w:pPr>
         <w:pStyle w:val="Heading2"/>
       </w:pPr>
       <w:r>
-        <w:t xml:space="preserve">3 Data Records</w:t>
+        <w:t xml:space="preserve">4 Data Records</w:t>
       </w:r>
     </w:p>
     <w:p>
@@ -2842,13 +4462,13 @@
         <w:t xml:space="preserve">is associated with both a Git tag and a persistent DOI.</w:t>
       </w:r>
     </w:p>
-    <w:bookmarkStart w:id="32" w:name="pre-built-knowledge-graph-zenodo"/>
+    <w:bookmarkStart w:id="38" w:name="pre-built-knowledge-graph-zenodo"/>
     <w:p>
       <w:pPr>
         <w:pStyle w:val="Heading3"/>
       </w:pPr>
       <w:r>
-        <w:t xml:space="preserve">3.1 Pre-built knowledge graph (Zenodo)</w:t>
+        <w:t xml:space="preserve">4.1 Pre-built knowledge graph (Zenodo)</w:t>
       </w:r>
     </w:p>
     <w:p>
@@ -2994,14 +4614,14 @@
         <w:t xml:space="preserve">self-contained even if the GitHub repository becomes unavailable.</w:t>
       </w:r>
     </w:p>
-    <w:bookmarkEnd w:id="32"/>
-    <w:bookmarkStart w:id="33" w:name="source-code-and-pipeline-github"/>
+    <w:bookmarkEnd w:id="38"/>
+    <w:bookmarkStart w:id="39" w:name="source-code-and-pipeline-github"/>
     <w:p>
       <w:pPr>
         <w:pStyle w:val="Heading3"/>
       </w:pPr>
       <w:r>
-        <w:t xml:space="preserve">3.2 Source code and pipeline (GitHub)</w:t>
+        <w:t xml:space="preserve">4.2 Source code and pipeline (GitHub)</w:t>
       </w:r>
     </w:p>
     <w:p>
@@ -3258,14 +4878,14 @@
         <w:t xml:space="preserve">.</w:t>
       </w:r>
     </w:p>
-    <w:bookmarkEnd w:id="33"/>
-    <w:bookmarkStart w:id="34" w:name="versioning-policy"/>
+    <w:bookmarkEnd w:id="39"/>
+    <w:bookmarkStart w:id="40" w:name="versioning-policy"/>
     <w:p>
       <w:pPr>
         <w:pStyle w:val="Heading3"/>
       </w:pPr>
       <w:r>
-        <w:t xml:space="preserve">3.3 Versioning policy</w:t>
+        <w:t xml:space="preserve">4.3 Versioning policy</w:t>
       </w:r>
     </w:p>
     <w:p>
@@ -4105,24 +5725,24 @@
         </w:tc>
       </w:tr>
     </w:tbl>
-    <w:bookmarkEnd w:id="34"/>
-    <w:bookmarkEnd w:id="35"/>
-    <w:bookmarkStart w:id="39" w:name="results"/>
+    <w:bookmarkEnd w:id="40"/>
+    <w:bookmarkEnd w:id="41"/>
+    <w:bookmarkStart w:id="45" w:name="results"/>
     <w:p>
       <w:pPr>
         <w:pStyle w:val="Heading2"/>
       </w:pPr>
       <w:r>
-        <w:t xml:space="preserve">4 Results</w:t>
-      </w:r>
-    </w:p>
-    <w:bookmarkStart w:id="36" w:name="Xe61b3263c11818f414bff186c9eeb7f679b331e"/>
+        <w:t xml:space="preserve">5 Results</w:t>
+      </w:r>
+    </w:p>
+    <w:bookmarkStart w:id="42" w:name="Xe61b3263c11818f414bff186c9eeb7f679b331e"/>
     <w:p>
       <w:pPr>
         <w:pStyle w:val="Heading3"/>
       </w:pPr>
       <w:r>
-        <w:t xml:space="preserve">4.1 Knowledge graph statistics and structural properties</w:t>
+        <w:t xml:space="preserve">5.1 Knowledge graph statistics and structural properties</w:t>
       </w:r>
     </w:p>
     <w:p>
@@ -4243,14 +5863,14 @@
         <w:t xml:space="preserve">analytical method codes) rather than per-edge PMIDs.</w:t>
       </w:r>
     </w:p>
-    <w:bookmarkEnd w:id="36"/>
-    <w:bookmarkStart w:id="37" w:name="competency-question-evaluation"/>
+    <w:bookmarkEnd w:id="42"/>
+    <w:bookmarkStart w:id="43" w:name="competency-question-evaluation"/>
     <w:p>
       <w:pPr>
         <w:pStyle w:val="Heading3"/>
       </w:pPr>
       <w:r>
-        <w:t xml:space="preserve">4.2 Competency-question evaluation</w:t>
+        <w:t xml:space="preserve">5.2 Competency-question evaluation</w:t>
       </w:r>
     </w:p>
     <w:p>
@@ -4730,14 +6350,14 @@
         <w:t xml:space="preserve">indicating the KG is interactively queryable at this scale.</w:t>
       </w:r>
     </w:p>
-    <w:bookmarkEnd w:id="37"/>
-    <w:bookmarkStart w:id="38" w:name="manual-edge-audit"/>
+    <w:bookmarkEnd w:id="43"/>
+    <w:bookmarkStart w:id="44" w:name="manual-edge-audit"/>
     <w:p>
       <w:pPr>
         <w:pStyle w:val="Heading3"/>
       </w:pPr>
       <w:r>
-        <w:t xml:space="preserve">4.3 Manual edge audit</w:t>
+        <w:t xml:space="preserve">5.3 Manual edge audit</w:t>
       </w:r>
     </w:p>
     <w:p>
@@ -5737,24 +7357,24 @@
         <w:t xml:space="preserve">.</w:t>
       </w:r>
     </w:p>
-    <w:bookmarkEnd w:id="38"/>
-    <w:bookmarkEnd w:id="39"/>
-    <w:bookmarkStart w:id="45" w:name="discussion"/>
+    <w:bookmarkEnd w:id="44"/>
+    <w:bookmarkEnd w:id="45"/>
+    <w:bookmarkStart w:id="51" w:name="discussion"/>
     <w:p>
       <w:pPr>
         <w:pStyle w:val="Heading2"/>
       </w:pPr>
       <w:r>
-        <w:t xml:space="preserve">5 Discussion</w:t>
-      </w:r>
-    </w:p>
-    <w:bookmarkStart w:id="40" w:name="principal-findings"/>
+        <w:t xml:space="preserve">6 Discussion</w:t>
+      </w:r>
+    </w:p>
+    <w:bookmarkStart w:id="46" w:name="principal-findings"/>
     <w:p>
       <w:pPr>
         <w:pStyle w:val="Heading3"/>
       </w:pPr>
       <w:r>
-        <w:t xml:space="preserve">5.1 Principal findings</w:t>
+        <w:t xml:space="preserve">6.1 Principal findings</w:t>
       </w:r>
     </w:p>
     <w:p>
@@ -5849,14 +7469,14 @@
         <w:t xml:space="preserve">upstream sources rather than integration errors.</w:t>
       </w:r>
     </w:p>
-    <w:bookmarkEnd w:id="40"/>
-    <w:bookmarkStart w:id="41" w:name="comparison-with-existing-resources"/>
+    <w:bookmarkEnd w:id="46"/>
+    <w:bookmarkStart w:id="47" w:name="comparison-with-existing-resources"/>
     <w:p>
       <w:pPr>
         <w:pStyle w:val="Heading3"/>
       </w:pPr>
       <w:r>
-        <w:t xml:space="preserve">5.2 Comparison with existing resources</w:t>
+        <w:t xml:space="preserve">6.2 Comparison with existing resources</w:t>
       </w:r>
     </w:p>
     <w:p>
@@ -5957,14 +7577,14 @@
         <w:t xml:space="preserve">biological dimensions simultaneously.</w:t>
       </w:r>
     </w:p>
-    <w:bookmarkEnd w:id="41"/>
-    <w:bookmarkStart w:id="42" w:name="methodological-insights"/>
+    <w:bookmarkEnd w:id="47"/>
+    <w:bookmarkStart w:id="48" w:name="methodological-insights"/>
     <w:p>
       <w:pPr>
         <w:pStyle w:val="Heading3"/>
       </w:pPr>
       <w:r>
-        <w:t xml:space="preserve">5.3 Methodological insights</w:t>
+        <w:t xml:space="preserve">6.3 Methodological insights</w:t>
       </w:r>
     </w:p>
     <w:p>
@@ -6090,14 +7710,14 @@
         <w:t xml:space="preserve">same query returned a clean ranked list of distinct microbe–metabolite pairs.</w:t>
       </w:r>
     </w:p>
-    <w:bookmarkEnd w:id="42"/>
-    <w:bookmarkStart w:id="43" w:name="limitations"/>
+    <w:bookmarkEnd w:id="48"/>
+    <w:bookmarkStart w:id="49" w:name="limitations"/>
     <w:p>
       <w:pPr>
         <w:pStyle w:val="Heading3"/>
       </w:pPr>
       <w:r>
-        <w:t xml:space="preserve">5.4 Limitations</w:t>
+        <w:t xml:space="preserve">6.4 Limitations</w:t>
       </w:r>
     </w:p>
     <w:p>
@@ -6192,14 +7812,14 @@
         <w:t xml:space="preserve">confidence interval; this is planned for v1.1.</w:t>
       </w:r>
     </w:p>
-    <w:bookmarkEnd w:id="43"/>
-    <w:bookmarkStart w:id="44" w:name="implications-and-future-work"/>
+    <w:bookmarkEnd w:id="49"/>
+    <w:bookmarkStart w:id="50" w:name="implications-and-future-work"/>
     <w:p>
       <w:pPr>
         <w:pStyle w:val="Heading3"/>
       </w:pPr>
       <w:r>
-        <w:t xml:space="preserve">5.5 Implications and future work</w:t>
+        <w:t xml:space="preserve">6.5 Implications and future work</w:t>
       </w:r>
     </w:p>
     <w:p>
@@ -6282,15 +7902,15 @@
         <w:t xml:space="preserve">annotation, and a second-annotator audit cycle.</w:t>
       </w:r>
     </w:p>
-    <w:bookmarkEnd w:id="44"/>
-    <w:bookmarkEnd w:id="45"/>
-    <w:bookmarkStart w:id="46" w:name="conclusion"/>
+    <w:bookmarkEnd w:id="50"/>
+    <w:bookmarkEnd w:id="51"/>
+    <w:bookmarkStart w:id="52" w:name="conclusion"/>
     <w:p>
       <w:pPr>
         <w:pStyle w:val="Heading2"/>
       </w:pPr>
       <w:r>
-        <w:t xml:space="preserve">6 Conclusion</w:t>
+        <w:t xml:space="preserve">7 Conclusion</w:t>
       </w:r>
     </w:p>
     <w:p>
@@ -6447,14 +8067,14 @@
         <w:t xml:space="preserve">against any single public knowledge graph.</w:t>
       </w:r>
     </w:p>
-    <w:bookmarkEnd w:id="46"/>
-    <w:bookmarkStart w:id="47" w:name="code-availability"/>
+    <w:bookmarkEnd w:id="52"/>
+    <w:bookmarkStart w:id="53" w:name="code-availability"/>
     <w:p>
       <w:pPr>
         <w:pStyle w:val="Heading2"/>
       </w:pPr>
       <w:r>
-        <w:t xml:space="preserve">7 Code Availability</w:t>
+        <w:t xml:space="preserve">8 Code Availability</w:t>
       </w:r>
     </w:p>
     <w:p>
@@ -6513,9 +8133,9 @@
         <w:t xml:space="preserve">.</w:t>
       </w:r>
     </w:p>
-    <w:bookmarkEnd w:id="47"/>
-    <w:bookmarkEnd w:id="48"/>
-    <w:bookmarkStart w:id="57" w:name="figure-captions"/>
+    <w:bookmarkEnd w:id="53"/>
+    <w:bookmarkEnd w:id="54"/>
+    <w:bookmarkStart w:id="63" w:name="figure-captions"/>
     <w:p>
       <w:pPr>
         <w:pStyle w:val="Heading1"/>
@@ -6524,7 +8144,7 @@
         <w:t xml:space="preserve">Figure captions</w:t>
       </w:r>
     </w:p>
-    <w:bookmarkStart w:id="49" w:name="X31eb2952c0ce1ed62efb66188f82029b817b965"/>
+    <w:bookmarkStart w:id="55" w:name="X31eb2952c0ce1ed62efb66188f82029b817b965"/>
     <w:p>
       <w:pPr>
         <w:pStyle w:val="Heading2"/>
@@ -6550,7 +8170,7 @@
         <w:t xml:space="preserve"> </w:t>
       </w:r>
       <w:r>
-        <w:t xml:space="preserve">green; foods, yellow); edges by relationship type (Methods §2.2). The graph</w:t>
+        <w:t xml:space="preserve">green; foods, yellow); edges by relationship type (Methods §3.2). The graph</w:t>
       </w:r>
       <w:r>
         <w:t xml:space="preserve"> </w:t>
@@ -6619,8 +8239,8 @@
         <w:t xml:space="preserve">respectively.</w:t>
       </w:r>
     </w:p>
-    <w:bookmarkEnd w:id="49"/>
-    <w:bookmarkStart w:id="50" w:name="X6f769ae58663be88121c6f91b888c353c6132aa"/>
+    <w:bookmarkEnd w:id="55"/>
+    <w:bookmarkStart w:id="56" w:name="X6f769ae58663be88121c6f91b888c353c6132aa"/>
     <w:p>
       <w:pPr>
         <w:pStyle w:val="Heading2"/>
@@ -6691,7 +8311,7 @@
         <w:t xml:space="preserve"> </w:t>
       </w:r>
       <w:r>
-        <w:t xml:space="preserve">Biolink Model v3.6 (Methods §2.2.2): for instance,</w:t>
+        <w:t xml:space="preserve">Biolink Model v3.6 (Methods §3.2.2): for instance,</w:t>
       </w:r>
       <w:r>
         <w:t xml:space="preserve"> </w:t>
@@ -6826,8 +8446,8 @@
         <w:t xml:space="preserve">single Cypher statement (cf. Figure 3).</w:t>
       </w:r>
     </w:p>
-    <w:bookmarkEnd w:id="50"/>
-    <w:bookmarkStart w:id="51" w:name="X4457906bebf92b80f0616bf3b994a48eaf00c49"/>
+    <w:bookmarkEnd w:id="56"/>
+    <w:bookmarkStart w:id="57" w:name="X4457906bebf92b80f0616bf3b994a48eaf00c49"/>
     <w:p>
       <w:pPr>
         <w:pStyle w:val="Heading2"/>
@@ -6999,7 +8619,7 @@
         <w:t xml:space="preserve"> </w:t>
       </w:r>
       <w:r>
-        <w:t xml:space="preserve">HNF4A, VEGFA, and ANGPTL4 (Methods §4.2).</w:t>
+        <w:t xml:space="preserve">HNF4A, VEGFA, and ANGPTL4 (Methods §5.2).</w:t>
       </w:r>
     </w:p>
     <w:p>
@@ -7009,8 +8629,8 @@
         </w:pict>
       </w:r>
     </w:p>
-    <w:bookmarkEnd w:id="51"/>
-    <w:bookmarkStart w:id="52" w:name="acknowledgments"/>
+    <w:bookmarkEnd w:id="57"/>
+    <w:bookmarkStart w:id="58" w:name="acknowledgments"/>
     <w:p>
       <w:pPr>
         <w:pStyle w:val="Heading2"/>
@@ -7039,8 +8659,8 @@
         <w:t xml:space="preserve">framework.</w:t>
       </w:r>
     </w:p>
-    <w:bookmarkEnd w:id="52"/>
-    <w:bookmarkStart w:id="53" w:name="author-contributions"/>
+    <w:bookmarkEnd w:id="58"/>
+    <w:bookmarkStart w:id="59" w:name="author-contributions"/>
     <w:p>
       <w:pPr>
         <w:pStyle w:val="Heading2"/>
@@ -7083,8 +8703,8 @@
         <w:t xml:space="preserve">: supervision, conceptualisation, writing — review and editing.</w:t>
       </w:r>
     </w:p>
-    <w:bookmarkEnd w:id="53"/>
-    <w:bookmarkStart w:id="54" w:name="competing-interests"/>
+    <w:bookmarkEnd w:id="59"/>
+    <w:bookmarkStart w:id="60" w:name="competing-interests"/>
     <w:p>
       <w:pPr>
         <w:pStyle w:val="Heading2"/>
@@ -7101,8 +8721,8 @@
         <w:t xml:space="preserve">The author(s) declare no competing interests.</w:t>
       </w:r>
     </w:p>
-    <w:bookmarkEnd w:id="54"/>
-    <w:bookmarkStart w:id="55" w:name="data-availability"/>
+    <w:bookmarkEnd w:id="60"/>
+    <w:bookmarkStart w:id="61" w:name="data-availability"/>
     <w:p>
       <w:pPr>
         <w:pStyle w:val="Heading2"/>
@@ -7131,8 +8751,8 @@
         <w:t xml:space="preserve">URLs and DOIs.</w:t>
       </w:r>
     </w:p>
-    <w:bookmarkEnd w:id="55"/>
-    <w:bookmarkStart w:id="56" w:name="references"/>
+    <w:bookmarkEnd w:id="61"/>
+    <w:bookmarkStart w:id="62" w:name="references"/>
     <w:p>
       <w:pPr>
         <w:pStyle w:val="Heading2"/>
@@ -7341,8 +8961,8 @@
         <w:t xml:space="preserve">. 2022. doi:10.1101/2022.04.13.22273750</w:t>
       </w:r>
     </w:p>
-    <w:bookmarkEnd w:id="56"/>
-    <w:bookmarkEnd w:id="57"/>
+    <w:bookmarkEnd w:id="62"/>
+    <w:bookmarkEnd w:id="63"/>
     <w:sectPr/>
   </w:body>
 </w:document>

</xml_diff>

<commit_message>
Fix final stale §4.3 reference (now §5.3)
</commit_message>
<xml_diff>
--- a/docs/paper/manuscript.docx
+++ b/docs/paper/manuscript.docx
@@ -564,13 +564,13 @@
         <w:t xml:space="preserve"> </w:t>
       </w:r>
       <w:r>
-        <w:t xml:space="preserve">methodology (§2), the released artifacts (§3), data quality assessment and competency</w:t>
-      </w:r>
-      <w:r>
-        <w:t xml:space="preserve"> </w:t>
-      </w:r>
-      <w:r>
-        <w:t xml:space="preserve">evaluation (§4), and example use-cases (§5).</w:t>
+        <w:t xml:space="preserve">the methodology (§3), the released artifacts (§4), data quality assessment and competency</w:t>
+      </w:r>
+      <w:r>
+        <w:t xml:space="preserve"> </w:t>
+      </w:r>
+      <w:r>
+        <w:t xml:space="preserve">evaluation (§5), and the broader implications (§6).</w:t>
       </w:r>
     </w:p>
     <w:bookmarkEnd w:id="21"/>
@@ -2806,7 +2806,7 @@
         <w:t xml:space="preserve"> </w:t>
       </w:r>
       <w:r>
-        <w:t xml:space="preserve">shipped by BioCypher v0.8.0 (the build framework, see §2.4) and avoids</w:t>
+        <w:t xml:space="preserve">shipped by BioCypher v0.8.0 (the build framework, see §3.4) and avoids</w:t>
       </w:r>
       <w:r>
         <w:t xml:space="preserve"> </w:t>
@@ -3345,7 +3345,7 @@
         <w:t xml:space="preserve"> </w:t>
       </w:r>
       <w:r>
-        <w:t xml:space="preserve">manual audit (§4.3) when inspection of edge property keys in Neo4j</w:t>
+        <w:t xml:space="preserve">manual audit (§5.3) when inspection of edge property keys in Neo4j</w:t>
       </w:r>
       <w:r>
         <w:t xml:space="preserve"> </w:t>
@@ -5822,7 +5822,7 @@
         <w:t xml:space="preserve"> </w:t>
       </w:r>
       <w:r>
-        <w:t xml:space="preserve">nutrient nodes), enabling the cross-layer queries described in §4.3.</w:t>
+        <w:t xml:space="preserve">nutrient nodes), enabling the cross-layer queries described in §5.3.</w:t>
       </w:r>
     </w:p>
     <w:p>
@@ -8742,7 +8742,7 @@
         <w:t xml:space="preserve"> </w:t>
       </w:r>
       <w:r>
-        <w:t xml:space="preserve">available under CC-BY-4.0; see §3 Data Records and §7 Code Availability for</w:t>
+        <w:t xml:space="preserve">available under CC-BY-4.0; see §4 Data Records and §8 Code Availability for</w:t>
       </w:r>
       <w:r>
         <w:t xml:space="preserve"> </w:t>

</xml_diff>